<commit_message>
Checklist : niveaux en gras et tableaux accessibles
Lisibilité de la checklist DOCX, à la demande d'Alex.

- Définitions des niveaux : « P - pratiqué », « C - contrôlé » et
  « S - signalé » en gras.
- Tableaux : ligne d'en-tête en gras ; titre (celui de la station)
  et description dans le texte de remplacement de chaque tableau.
- Règle P-14 du TP désormais verrouillée par un test : titre
  avant le tableau, en-tête répété, lignes insécables, ni fusion,
  ni imbrication, ni tableau flottant.
</commit_message>
<xml_diff>
--- a/livrables-IGPDE-2026-102846/Formateur/tp-word-igpde/checklist-accessibilite-bureautique.docx
+++ b/livrables-IGPDE-2026-102846/Formateur/tp-word-igpde/checklist-accessibilite-bureautique.docx
@@ -20,7 +20,13 @@
         <w:pStyle w:val="ListBullet"/>
       </w:pPr>
       <w:r>
-        <w:t>P - pratiqué : une action est réalisée et sa preuve est conservée.</w:t>
+        <w:rPr>
+          <w:b/>
+        </w:rPr>
+        <w:t>P - pratiqué :</w:t>
+      </w:r>
+      <w:r>
+        <w:t xml:space="preserve"> une action est réalisée et sa preuve est conservée.</w:t>
       </w:r>
     </w:p>
     <w:p>
@@ -28,7 +34,13 @@
         <w:pStyle w:val="ListBullet"/>
       </w:pPr>
       <w:r>
-        <w:t>C - contrôlé : un outil ou une vérification humaine est exécuté et son résultat est noté.</w:t>
+        <w:rPr>
+          <w:b/>
+        </w:rPr>
+        <w:t>C - contrôlé :</w:t>
+      </w:r>
+      <w:r>
+        <w:t xml:space="preserve"> un outil ou une vérification humaine est exécuté et son résultat est noté.</w:t>
       </w:r>
     </w:p>
     <w:p>
@@ -36,7 +48,13 @@
         <w:pStyle w:val="ListBullet"/>
       </w:pPr>
       <w:r>
-        <w:t>S - signalé : le point est vérifié sans manipulation obligatoire pendant le TP.</w:t>
+        <w:rPr>
+          <w:b/>
+        </w:rPr>
+        <w:t>S - signalé :</w:t>
+      </w:r>
+      <w:r>
+        <w:t xml:space="preserve"> le point est vérifié sans manipulation obligatoire pendant le TP.</w:t>
       </w:r>
     </w:p>
     <w:p>
@@ -53,6 +71,8 @@
         <w:tblW w:type="auto" w:w="0"/>
         <w:jc w:val="center"/>
         <w:tblLook w:firstColumn="1" w:firstRow="1" w:lastColumn="0" w:lastRow="0" w:noHBand="0" w:noVBand="1" w:val="04A0"/>
+        <w:tblCaption w:val="Structurer et naviguer"/>
+        <w:tblDescription w:val="Une ligne par point : identifiant et niveau, point à vérifier, cases de suivi et notes."/>
       </w:tblPr>
       <w:tblGrid>
         <w:gridCol w:w="2880"/>
@@ -70,6 +90,9 @@
           </w:tcPr>
           <w:p>
             <w:r>
+              <w:rPr>
+                <w:b/>
+              </w:rPr>
               <w:t>Identifiant et niveau</w:t>
             </w:r>
           </w:p>
@@ -80,6 +103,9 @@
           </w:tcPr>
           <w:p>
             <w:r>
+              <w:rPr>
+                <w:b/>
+              </w:rPr>
               <w:t>Point à vérifier</w:t>
             </w:r>
           </w:p>
@@ -90,6 +116,9 @@
           </w:tcPr>
           <w:p>
             <w:r>
+              <w:rPr>
+                <w:b/>
+              </w:rPr>
               <w:t>Suivi</w:t>
             </w:r>
           </w:p>
@@ -315,6 +344,8 @@
         <w:tblW w:type="auto" w:w="0"/>
         <w:jc w:val="center"/>
         <w:tblLook w:firstColumn="1" w:firstRow="1" w:lastColumn="0" w:lastRow="0" w:noHBand="0" w:noVBand="1" w:val="04A0"/>
+        <w:tblCaption w:val="Rendre les contenus et les liens compréhensibles"/>
+        <w:tblDescription w:val="Une ligne par point : identifiant et niveau, point à vérifier, cases de suivi et notes."/>
       </w:tblPr>
       <w:tblGrid>
         <w:gridCol w:w="2880"/>
@@ -332,6 +363,9 @@
           </w:tcPr>
           <w:p>
             <w:r>
+              <w:rPr>
+                <w:b/>
+              </w:rPr>
               <w:t>Identifiant et niveau</w:t>
             </w:r>
           </w:p>
@@ -342,6 +376,9 @@
           </w:tcPr>
           <w:p>
             <w:r>
+              <w:rPr>
+                <w:b/>
+              </w:rPr>
               <w:t>Point à vérifier</w:t>
             </w:r>
           </w:p>
@@ -352,6 +389,9 @@
           </w:tcPr>
           <w:p>
             <w:r>
+              <w:rPr>
+                <w:b/>
+              </w:rPr>
               <w:t>Suivi</w:t>
             </w:r>
           </w:p>
@@ -618,6 +658,8 @@
         <w:tblW w:type="auto" w:w="0"/>
         <w:jc w:val="center"/>
         <w:tblLook w:firstColumn="1" w:firstRow="1" w:lastColumn="0" w:lastRow="0" w:noHBand="0" w:noVBand="1" w:val="04A0"/>
+        <w:tblCaption w:val="Sécuriser couleurs, graphiques et tableaux"/>
+        <w:tblDescription w:val="Une ligne par point : identifiant et niveau, point à vérifier, cases de suivi et notes."/>
       </w:tblPr>
       <w:tblGrid>
         <w:gridCol w:w="2880"/>
@@ -635,6 +677,9 @@
           </w:tcPr>
           <w:p>
             <w:r>
+              <w:rPr>
+                <w:b/>
+              </w:rPr>
               <w:t>Identifiant et niveau</w:t>
             </w:r>
           </w:p>
@@ -645,6 +690,9 @@
           </w:tcPr>
           <w:p>
             <w:r>
+              <w:rPr>
+                <w:b/>
+              </w:rPr>
               <w:t>Point à vérifier</w:t>
             </w:r>
           </w:p>
@@ -655,6 +703,9 @@
           </w:tcPr>
           <w:p>
             <w:r>
+              <w:rPr>
+                <w:b/>
+              </w:rPr>
               <w:t>Suivi</w:t>
             </w:r>
           </w:p>
@@ -798,6 +849,8 @@
         <w:tblW w:type="auto" w:w="0"/>
         <w:jc w:val="center"/>
         <w:tblLook w:firstColumn="1" w:firstRow="1" w:lastColumn="0" w:lastRow="0" w:noHBand="0" w:noVBand="1" w:val="04A0"/>
+        <w:tblCaption w:val="Régler langues et lisibilité"/>
+        <w:tblDescription w:val="Une ligne par point : identifiant et niveau, point à vérifier, cases de suivi et notes."/>
       </w:tblPr>
       <w:tblGrid>
         <w:gridCol w:w="2880"/>
@@ -815,6 +868,9 @@
           </w:tcPr>
           <w:p>
             <w:r>
+              <w:rPr>
+                <w:b/>
+              </w:rPr>
               <w:t>Identifiant et niveau</w:t>
             </w:r>
           </w:p>
@@ -825,6 +881,9 @@
           </w:tcPr>
           <w:p>
             <w:r>
+              <w:rPr>
+                <w:b/>
+              </w:rPr>
               <w:t>Point à vérifier</w:t>
             </w:r>
           </w:p>
@@ -835,6 +894,9 @@
           </w:tcPr>
           <w:p>
             <w:r>
+              <w:rPr>
+                <w:b/>
+              </w:rPr>
               <w:t>Suivi</w:t>
             </w:r>
           </w:p>
@@ -1019,6 +1081,8 @@
         <w:tblW w:type="auto" w:w="0"/>
         <w:jc w:val="center"/>
         <w:tblLook w:firstColumn="1" w:firstRow="1" w:lastColumn="0" w:lastRow="0" w:noHBand="0" w:noVBand="1" w:val="04A0"/>
+        <w:tblCaption w:val="Finaliser, vérifier, exporter et contrôler"/>
+        <w:tblDescription w:val="Une ligne par point : identifiant et niveau, point à vérifier, cases de suivi et notes."/>
       </w:tblPr>
       <w:tblGrid>
         <w:gridCol w:w="2880"/>
@@ -1036,6 +1100,9 @@
           </w:tcPr>
           <w:p>
             <w:r>
+              <w:rPr>
+                <w:b/>
+              </w:rPr>
               <w:t>Identifiant et niveau</w:t>
             </w:r>
           </w:p>
@@ -1046,6 +1113,9 @@
           </w:tcPr>
           <w:p>
             <w:r>
+              <w:rPr>
+                <w:b/>
+              </w:rPr>
               <w:t>Point à vérifier</w:t>
             </w:r>
           </w:p>
@@ -1056,6 +1126,9 @@
           </w:tcPr>
           <w:p>
             <w:r>
+              <w:rPr>
+                <w:b/>
+              </w:rPr>
               <w:t>Suivi</w:t>
             </w:r>
           </w:p>
@@ -1245,6 +1318,8 @@
         <w:tblW w:type="auto" w:w="0"/>
         <w:jc w:val="center"/>
         <w:tblLook w:firstColumn="1" w:firstRow="1" w:lastColumn="0" w:lastRow="0" w:noHBand="0" w:noVBand="1" w:val="04A0"/>
+        <w:tblCaption w:val="Contrôles signalés"/>
+        <w:tblDescription w:val="Une ligne par point : identifiant et niveau, point à vérifier, cases de suivi et notes."/>
       </w:tblPr>
       <w:tblGrid>
         <w:gridCol w:w="2880"/>
@@ -1262,6 +1337,9 @@
           </w:tcPr>
           <w:p>
             <w:r>
+              <w:rPr>
+                <w:b/>
+              </w:rPr>
               <w:t>Identifiant et niveau</w:t>
             </w:r>
           </w:p>
@@ -1272,6 +1350,9 @@
           </w:tcPr>
           <w:p>
             <w:r>
+              <w:rPr>
+                <w:b/>
+              </w:rPr>
               <w:t>Point à vérifier</w:t>
             </w:r>
           </w:p>
@@ -1282,6 +1363,9 @@
           </w:tcPr>
           <w:p>
             <w:r>
+              <w:rPr>
+                <w:b/>
+              </w:rPr>
               <w:t>Suivi</w:t>
             </w:r>
           </w:p>

</xml_diff>

<commit_message>
Checklist : titres Arial et colonne élargie
Lisibilité de la checklist DOCX, à la demande d'Alex.

- Titre et titres de station en Arial : les polices de thème du
  modèle Word (Calibri Light) sont remplacées par une police
  explicite, couleurs et tailles inchangées.
- Tableaux : colonnes de 1,3, 3,2 et 1,5 pouces au lieu de trois
  colonnes égales ; chaque point à vérifier tient en deux lignes.
</commit_message>
<xml_diff>
--- a/livrables-IGPDE-2026-102846/Formateur/tp-word-igpde/checklist-accessibilite-bureautique.docx
+++ b/livrables-IGPDE-2026-102846/Formateur/tp-word-igpde/checklist-accessibilite-bureautique.docx
@@ -70,14 +70,15 @@
         <w:tblStyle w:val="TableGrid"/>
         <w:tblW w:type="auto" w:w="0"/>
         <w:jc w:val="center"/>
+        <w:tblLayout w:type="fixed"/>
         <w:tblLook w:firstColumn="1" w:firstRow="1" w:lastColumn="0" w:lastRow="0" w:noHBand="0" w:noVBand="1" w:val="04A0"/>
         <w:tblCaption w:val="Structurer et naviguer"/>
         <w:tblDescription w:val="Une ligne par point : identifiant et niveau, point à vérifier, cases de suivi et notes."/>
       </w:tblPr>
       <w:tblGrid>
-        <w:gridCol w:w="2880"/>
-        <w:gridCol w:w="2880"/>
-        <w:gridCol w:w="2880"/>
+        <w:gridCol w:w="1872"/>
+        <w:gridCol w:w="4608"/>
+        <w:gridCol w:w="2160"/>
       </w:tblGrid>
       <w:tr>
         <w:trPr>
@@ -86,7 +87,7 @@
         </w:trPr>
         <w:tc>
           <w:tcPr>
-            <w:tcW w:type="dxa" w:w="2880"/>
+            <w:tcW w:type="dxa" w:w="1872"/>
           </w:tcPr>
           <w:p>
             <w:r>
@@ -99,7 +100,7 @@
         </w:tc>
         <w:tc>
           <w:tcPr>
-            <w:tcW w:type="dxa" w:w="2880"/>
+            <w:tcW w:type="dxa" w:w="4608"/>
           </w:tcPr>
           <w:p>
             <w:r>
@@ -112,7 +113,7 @@
         </w:tc>
         <w:tc>
           <w:tcPr>
-            <w:tcW w:type="dxa" w:w="2880"/>
+            <w:tcW w:type="dxa" w:w="2160"/>
           </w:tcPr>
           <w:p>
             <w:r>
@@ -130,7 +131,7 @@
         </w:trPr>
         <w:tc>
           <w:tcPr>
-            <w:tcW w:type="dxa" w:w="2880"/>
+            <w:tcW w:type="dxa" w:w="1872"/>
           </w:tcPr>
           <w:p>
             <w:r>
@@ -140,7 +141,7 @@
         </w:tc>
         <w:tc>
           <w:tcPr>
-            <w:tcW w:type="dxa" w:w="2880"/>
+            <w:tcW w:type="dxa" w:w="4608"/>
           </w:tcPr>
           <w:p>
             <w:r>
@@ -150,7 +151,7 @@
         </w:tc>
         <w:tc>
           <w:tcPr>
-            <w:tcW w:type="dxa" w:w="2880"/>
+            <w:tcW w:type="dxa" w:w="2160"/>
           </w:tcPr>
           <w:p>
             <w:r>
@@ -171,7 +172,7 @@
         </w:trPr>
         <w:tc>
           <w:tcPr>
-            <w:tcW w:type="dxa" w:w="2880"/>
+            <w:tcW w:type="dxa" w:w="1872"/>
           </w:tcPr>
           <w:p>
             <w:r>
@@ -181,7 +182,7 @@
         </w:tc>
         <w:tc>
           <w:tcPr>
-            <w:tcW w:type="dxa" w:w="2880"/>
+            <w:tcW w:type="dxa" w:w="4608"/>
           </w:tcPr>
           <w:p>
             <w:r>
@@ -191,7 +192,7 @@
         </w:tc>
         <w:tc>
           <w:tcPr>
-            <w:tcW w:type="dxa" w:w="2880"/>
+            <w:tcW w:type="dxa" w:w="2160"/>
           </w:tcPr>
           <w:p>
             <w:r>
@@ -212,7 +213,7 @@
         </w:trPr>
         <w:tc>
           <w:tcPr>
-            <w:tcW w:type="dxa" w:w="2880"/>
+            <w:tcW w:type="dxa" w:w="1872"/>
           </w:tcPr>
           <w:p>
             <w:r>
@@ -222,7 +223,7 @@
         </w:tc>
         <w:tc>
           <w:tcPr>
-            <w:tcW w:type="dxa" w:w="2880"/>
+            <w:tcW w:type="dxa" w:w="4608"/>
           </w:tcPr>
           <w:p>
             <w:r>
@@ -232,7 +233,7 @@
         </w:tc>
         <w:tc>
           <w:tcPr>
-            <w:tcW w:type="dxa" w:w="2880"/>
+            <w:tcW w:type="dxa" w:w="2160"/>
           </w:tcPr>
           <w:p>
             <w:r>
@@ -253,7 +254,7 @@
         </w:trPr>
         <w:tc>
           <w:tcPr>
-            <w:tcW w:type="dxa" w:w="2880"/>
+            <w:tcW w:type="dxa" w:w="1872"/>
           </w:tcPr>
           <w:p>
             <w:r>
@@ -263,7 +264,7 @@
         </w:tc>
         <w:tc>
           <w:tcPr>
-            <w:tcW w:type="dxa" w:w="2880"/>
+            <w:tcW w:type="dxa" w:w="4608"/>
           </w:tcPr>
           <w:p>
             <w:r>
@@ -273,7 +274,7 @@
         </w:tc>
         <w:tc>
           <w:tcPr>
-            <w:tcW w:type="dxa" w:w="2880"/>
+            <w:tcW w:type="dxa" w:w="2160"/>
           </w:tcPr>
           <w:p>
             <w:r>
@@ -294,7 +295,7 @@
         </w:trPr>
         <w:tc>
           <w:tcPr>
-            <w:tcW w:type="dxa" w:w="2880"/>
+            <w:tcW w:type="dxa" w:w="1872"/>
           </w:tcPr>
           <w:p>
             <w:r>
@@ -304,7 +305,7 @@
         </w:tc>
         <w:tc>
           <w:tcPr>
-            <w:tcW w:type="dxa" w:w="2880"/>
+            <w:tcW w:type="dxa" w:w="4608"/>
           </w:tcPr>
           <w:p>
             <w:r>
@@ -314,7 +315,7 @@
         </w:tc>
         <w:tc>
           <w:tcPr>
-            <w:tcW w:type="dxa" w:w="2880"/>
+            <w:tcW w:type="dxa" w:w="2160"/>
           </w:tcPr>
           <w:p>
             <w:r>
@@ -343,14 +344,15 @@
         <w:tblStyle w:val="TableGrid"/>
         <w:tblW w:type="auto" w:w="0"/>
         <w:jc w:val="center"/>
+        <w:tblLayout w:type="fixed"/>
         <w:tblLook w:firstColumn="1" w:firstRow="1" w:lastColumn="0" w:lastRow="0" w:noHBand="0" w:noVBand="1" w:val="04A0"/>
         <w:tblCaption w:val="Rendre les contenus et les liens compréhensibles"/>
         <w:tblDescription w:val="Une ligne par point : identifiant et niveau, point à vérifier, cases de suivi et notes."/>
       </w:tblPr>
       <w:tblGrid>
-        <w:gridCol w:w="2880"/>
-        <w:gridCol w:w="2880"/>
-        <w:gridCol w:w="2880"/>
+        <w:gridCol w:w="1872"/>
+        <w:gridCol w:w="4608"/>
+        <w:gridCol w:w="2160"/>
       </w:tblGrid>
       <w:tr>
         <w:trPr>
@@ -359,7 +361,7 @@
         </w:trPr>
         <w:tc>
           <w:tcPr>
-            <w:tcW w:type="dxa" w:w="2880"/>
+            <w:tcW w:type="dxa" w:w="1872"/>
           </w:tcPr>
           <w:p>
             <w:r>
@@ -372,7 +374,7 @@
         </w:tc>
         <w:tc>
           <w:tcPr>
-            <w:tcW w:type="dxa" w:w="2880"/>
+            <w:tcW w:type="dxa" w:w="4608"/>
           </w:tcPr>
           <w:p>
             <w:r>
@@ -385,7 +387,7 @@
         </w:tc>
         <w:tc>
           <w:tcPr>
-            <w:tcW w:type="dxa" w:w="2880"/>
+            <w:tcW w:type="dxa" w:w="2160"/>
           </w:tcPr>
           <w:p>
             <w:r>
@@ -403,7 +405,7 @@
         </w:trPr>
         <w:tc>
           <w:tcPr>
-            <w:tcW w:type="dxa" w:w="2880"/>
+            <w:tcW w:type="dxa" w:w="1872"/>
           </w:tcPr>
           <w:p>
             <w:r>
@@ -413,7 +415,7 @@
         </w:tc>
         <w:tc>
           <w:tcPr>
-            <w:tcW w:type="dxa" w:w="2880"/>
+            <w:tcW w:type="dxa" w:w="4608"/>
           </w:tcPr>
           <w:p>
             <w:r>
@@ -423,7 +425,7 @@
         </w:tc>
         <w:tc>
           <w:tcPr>
-            <w:tcW w:type="dxa" w:w="2880"/>
+            <w:tcW w:type="dxa" w:w="2160"/>
           </w:tcPr>
           <w:p>
             <w:r>
@@ -444,7 +446,7 @@
         </w:trPr>
         <w:tc>
           <w:tcPr>
-            <w:tcW w:type="dxa" w:w="2880"/>
+            <w:tcW w:type="dxa" w:w="1872"/>
           </w:tcPr>
           <w:p>
             <w:r>
@@ -454,7 +456,7 @@
         </w:tc>
         <w:tc>
           <w:tcPr>
-            <w:tcW w:type="dxa" w:w="2880"/>
+            <w:tcW w:type="dxa" w:w="4608"/>
           </w:tcPr>
           <w:p>
             <w:r>
@@ -464,7 +466,7 @@
         </w:tc>
         <w:tc>
           <w:tcPr>
-            <w:tcW w:type="dxa" w:w="2880"/>
+            <w:tcW w:type="dxa" w:w="2160"/>
           </w:tcPr>
           <w:p>
             <w:r>
@@ -485,7 +487,7 @@
         </w:trPr>
         <w:tc>
           <w:tcPr>
-            <w:tcW w:type="dxa" w:w="2880"/>
+            <w:tcW w:type="dxa" w:w="1872"/>
           </w:tcPr>
           <w:p>
             <w:r>
@@ -495,7 +497,7 @@
         </w:tc>
         <w:tc>
           <w:tcPr>
-            <w:tcW w:type="dxa" w:w="2880"/>
+            <w:tcW w:type="dxa" w:w="4608"/>
           </w:tcPr>
           <w:p>
             <w:r>
@@ -505,7 +507,7 @@
         </w:tc>
         <w:tc>
           <w:tcPr>
-            <w:tcW w:type="dxa" w:w="2880"/>
+            <w:tcW w:type="dxa" w:w="2160"/>
           </w:tcPr>
           <w:p>
             <w:r>
@@ -526,7 +528,7 @@
         </w:trPr>
         <w:tc>
           <w:tcPr>
-            <w:tcW w:type="dxa" w:w="2880"/>
+            <w:tcW w:type="dxa" w:w="1872"/>
           </w:tcPr>
           <w:p>
             <w:r>
@@ -536,7 +538,7 @@
         </w:tc>
         <w:tc>
           <w:tcPr>
-            <w:tcW w:type="dxa" w:w="2880"/>
+            <w:tcW w:type="dxa" w:w="4608"/>
           </w:tcPr>
           <w:p>
             <w:r>
@@ -546,7 +548,7 @@
         </w:tc>
         <w:tc>
           <w:tcPr>
-            <w:tcW w:type="dxa" w:w="2880"/>
+            <w:tcW w:type="dxa" w:w="2160"/>
           </w:tcPr>
           <w:p>
             <w:r>
@@ -567,7 +569,7 @@
         </w:trPr>
         <w:tc>
           <w:tcPr>
-            <w:tcW w:type="dxa" w:w="2880"/>
+            <w:tcW w:type="dxa" w:w="1872"/>
           </w:tcPr>
           <w:p>
             <w:r>
@@ -577,7 +579,7 @@
         </w:tc>
         <w:tc>
           <w:tcPr>
-            <w:tcW w:type="dxa" w:w="2880"/>
+            <w:tcW w:type="dxa" w:w="4608"/>
           </w:tcPr>
           <w:p>
             <w:r>
@@ -587,7 +589,7 @@
         </w:tc>
         <w:tc>
           <w:tcPr>
-            <w:tcW w:type="dxa" w:w="2880"/>
+            <w:tcW w:type="dxa" w:w="2160"/>
           </w:tcPr>
           <w:p>
             <w:r>
@@ -608,7 +610,7 @@
         </w:trPr>
         <w:tc>
           <w:tcPr>
-            <w:tcW w:type="dxa" w:w="2880"/>
+            <w:tcW w:type="dxa" w:w="1872"/>
           </w:tcPr>
           <w:p>
             <w:r>
@@ -618,7 +620,7 @@
         </w:tc>
         <w:tc>
           <w:tcPr>
-            <w:tcW w:type="dxa" w:w="2880"/>
+            <w:tcW w:type="dxa" w:w="4608"/>
           </w:tcPr>
           <w:p>
             <w:r>
@@ -628,7 +630,7 @@
         </w:tc>
         <w:tc>
           <w:tcPr>
-            <w:tcW w:type="dxa" w:w="2880"/>
+            <w:tcW w:type="dxa" w:w="2160"/>
           </w:tcPr>
           <w:p>
             <w:r>
@@ -657,14 +659,15 @@
         <w:tblStyle w:val="TableGrid"/>
         <w:tblW w:type="auto" w:w="0"/>
         <w:jc w:val="center"/>
+        <w:tblLayout w:type="fixed"/>
         <w:tblLook w:firstColumn="1" w:firstRow="1" w:lastColumn="0" w:lastRow="0" w:noHBand="0" w:noVBand="1" w:val="04A0"/>
         <w:tblCaption w:val="Sécuriser couleurs, graphiques et tableaux"/>
         <w:tblDescription w:val="Une ligne par point : identifiant et niveau, point à vérifier, cases de suivi et notes."/>
       </w:tblPr>
       <w:tblGrid>
-        <w:gridCol w:w="2880"/>
-        <w:gridCol w:w="2880"/>
-        <w:gridCol w:w="2880"/>
+        <w:gridCol w:w="1872"/>
+        <w:gridCol w:w="4608"/>
+        <w:gridCol w:w="2160"/>
       </w:tblGrid>
       <w:tr>
         <w:trPr>
@@ -673,7 +676,7 @@
         </w:trPr>
         <w:tc>
           <w:tcPr>
-            <w:tcW w:type="dxa" w:w="2880"/>
+            <w:tcW w:type="dxa" w:w="1872"/>
           </w:tcPr>
           <w:p>
             <w:r>
@@ -686,7 +689,7 @@
         </w:tc>
         <w:tc>
           <w:tcPr>
-            <w:tcW w:type="dxa" w:w="2880"/>
+            <w:tcW w:type="dxa" w:w="4608"/>
           </w:tcPr>
           <w:p>
             <w:r>
@@ -699,7 +702,7 @@
         </w:tc>
         <w:tc>
           <w:tcPr>
-            <w:tcW w:type="dxa" w:w="2880"/>
+            <w:tcW w:type="dxa" w:w="2160"/>
           </w:tcPr>
           <w:p>
             <w:r>
@@ -717,7 +720,7 @@
         </w:trPr>
         <w:tc>
           <w:tcPr>
-            <w:tcW w:type="dxa" w:w="2880"/>
+            <w:tcW w:type="dxa" w:w="1872"/>
           </w:tcPr>
           <w:p>
             <w:r>
@@ -727,7 +730,7 @@
         </w:tc>
         <w:tc>
           <w:tcPr>
-            <w:tcW w:type="dxa" w:w="2880"/>
+            <w:tcW w:type="dxa" w:w="4608"/>
           </w:tcPr>
           <w:p>
             <w:r>
@@ -737,7 +740,7 @@
         </w:tc>
         <w:tc>
           <w:tcPr>
-            <w:tcW w:type="dxa" w:w="2880"/>
+            <w:tcW w:type="dxa" w:w="2160"/>
           </w:tcPr>
           <w:p>
             <w:r>
@@ -758,7 +761,7 @@
         </w:trPr>
         <w:tc>
           <w:tcPr>
-            <w:tcW w:type="dxa" w:w="2880"/>
+            <w:tcW w:type="dxa" w:w="1872"/>
           </w:tcPr>
           <w:p>
             <w:r>
@@ -768,7 +771,7 @@
         </w:tc>
         <w:tc>
           <w:tcPr>
-            <w:tcW w:type="dxa" w:w="2880"/>
+            <w:tcW w:type="dxa" w:w="4608"/>
           </w:tcPr>
           <w:p>
             <w:r>
@@ -778,7 +781,7 @@
         </w:tc>
         <w:tc>
           <w:tcPr>
-            <w:tcW w:type="dxa" w:w="2880"/>
+            <w:tcW w:type="dxa" w:w="2160"/>
           </w:tcPr>
           <w:p>
             <w:r>
@@ -799,7 +802,7 @@
         </w:trPr>
         <w:tc>
           <w:tcPr>
-            <w:tcW w:type="dxa" w:w="2880"/>
+            <w:tcW w:type="dxa" w:w="1872"/>
           </w:tcPr>
           <w:p>
             <w:r>
@@ -809,7 +812,7 @@
         </w:tc>
         <w:tc>
           <w:tcPr>
-            <w:tcW w:type="dxa" w:w="2880"/>
+            <w:tcW w:type="dxa" w:w="4608"/>
           </w:tcPr>
           <w:p>
             <w:r>
@@ -819,7 +822,7 @@
         </w:tc>
         <w:tc>
           <w:tcPr>
-            <w:tcW w:type="dxa" w:w="2880"/>
+            <w:tcW w:type="dxa" w:w="2160"/>
           </w:tcPr>
           <w:p>
             <w:r>
@@ -848,14 +851,15 @@
         <w:tblStyle w:val="TableGrid"/>
         <w:tblW w:type="auto" w:w="0"/>
         <w:jc w:val="center"/>
+        <w:tblLayout w:type="fixed"/>
         <w:tblLook w:firstColumn="1" w:firstRow="1" w:lastColumn="0" w:lastRow="0" w:noHBand="0" w:noVBand="1" w:val="04A0"/>
         <w:tblCaption w:val="Régler langues et lisibilité"/>
         <w:tblDescription w:val="Une ligne par point : identifiant et niveau, point à vérifier, cases de suivi et notes."/>
       </w:tblPr>
       <w:tblGrid>
-        <w:gridCol w:w="2880"/>
-        <w:gridCol w:w="2880"/>
-        <w:gridCol w:w="2880"/>
+        <w:gridCol w:w="1872"/>
+        <w:gridCol w:w="4608"/>
+        <w:gridCol w:w="2160"/>
       </w:tblGrid>
       <w:tr>
         <w:trPr>
@@ -864,7 +868,7 @@
         </w:trPr>
         <w:tc>
           <w:tcPr>
-            <w:tcW w:type="dxa" w:w="2880"/>
+            <w:tcW w:type="dxa" w:w="1872"/>
           </w:tcPr>
           <w:p>
             <w:r>
@@ -877,7 +881,7 @@
         </w:tc>
         <w:tc>
           <w:tcPr>
-            <w:tcW w:type="dxa" w:w="2880"/>
+            <w:tcW w:type="dxa" w:w="4608"/>
           </w:tcPr>
           <w:p>
             <w:r>
@@ -890,7 +894,7 @@
         </w:tc>
         <w:tc>
           <w:tcPr>
-            <w:tcW w:type="dxa" w:w="2880"/>
+            <w:tcW w:type="dxa" w:w="2160"/>
           </w:tcPr>
           <w:p>
             <w:r>
@@ -908,7 +912,7 @@
         </w:trPr>
         <w:tc>
           <w:tcPr>
-            <w:tcW w:type="dxa" w:w="2880"/>
+            <w:tcW w:type="dxa" w:w="1872"/>
           </w:tcPr>
           <w:p>
             <w:r>
@@ -918,7 +922,7 @@
         </w:tc>
         <w:tc>
           <w:tcPr>
-            <w:tcW w:type="dxa" w:w="2880"/>
+            <w:tcW w:type="dxa" w:w="4608"/>
           </w:tcPr>
           <w:p>
             <w:r>
@@ -928,7 +932,7 @@
         </w:tc>
         <w:tc>
           <w:tcPr>
-            <w:tcW w:type="dxa" w:w="2880"/>
+            <w:tcW w:type="dxa" w:w="2160"/>
           </w:tcPr>
           <w:p>
             <w:r>
@@ -949,7 +953,7 @@
         </w:trPr>
         <w:tc>
           <w:tcPr>
-            <w:tcW w:type="dxa" w:w="2880"/>
+            <w:tcW w:type="dxa" w:w="1872"/>
           </w:tcPr>
           <w:p>
             <w:r>
@@ -959,7 +963,7 @@
         </w:tc>
         <w:tc>
           <w:tcPr>
-            <w:tcW w:type="dxa" w:w="2880"/>
+            <w:tcW w:type="dxa" w:w="4608"/>
           </w:tcPr>
           <w:p>
             <w:r>
@@ -969,7 +973,7 @@
         </w:tc>
         <w:tc>
           <w:tcPr>
-            <w:tcW w:type="dxa" w:w="2880"/>
+            <w:tcW w:type="dxa" w:w="2160"/>
           </w:tcPr>
           <w:p>
             <w:r>
@@ -990,7 +994,7 @@
         </w:trPr>
         <w:tc>
           <w:tcPr>
-            <w:tcW w:type="dxa" w:w="2880"/>
+            <w:tcW w:type="dxa" w:w="1872"/>
           </w:tcPr>
           <w:p>
             <w:r>
@@ -1000,7 +1004,7 @@
         </w:tc>
         <w:tc>
           <w:tcPr>
-            <w:tcW w:type="dxa" w:w="2880"/>
+            <w:tcW w:type="dxa" w:w="4608"/>
           </w:tcPr>
           <w:p>
             <w:r>
@@ -1010,7 +1014,7 @@
         </w:tc>
         <w:tc>
           <w:tcPr>
-            <w:tcW w:type="dxa" w:w="2880"/>
+            <w:tcW w:type="dxa" w:w="2160"/>
           </w:tcPr>
           <w:p>
             <w:r>
@@ -1031,7 +1035,7 @@
         </w:trPr>
         <w:tc>
           <w:tcPr>
-            <w:tcW w:type="dxa" w:w="2880"/>
+            <w:tcW w:type="dxa" w:w="1872"/>
           </w:tcPr>
           <w:p>
             <w:r>
@@ -1041,7 +1045,7 @@
         </w:tc>
         <w:tc>
           <w:tcPr>
-            <w:tcW w:type="dxa" w:w="2880"/>
+            <w:tcW w:type="dxa" w:w="4608"/>
           </w:tcPr>
           <w:p>
             <w:r>
@@ -1051,7 +1055,7 @@
         </w:tc>
         <w:tc>
           <w:tcPr>
-            <w:tcW w:type="dxa" w:w="2880"/>
+            <w:tcW w:type="dxa" w:w="2160"/>
           </w:tcPr>
           <w:p>
             <w:r>
@@ -1080,14 +1084,15 @@
         <w:tblStyle w:val="TableGrid"/>
         <w:tblW w:type="auto" w:w="0"/>
         <w:jc w:val="center"/>
+        <w:tblLayout w:type="fixed"/>
         <w:tblLook w:firstColumn="1" w:firstRow="1" w:lastColumn="0" w:lastRow="0" w:noHBand="0" w:noVBand="1" w:val="04A0"/>
         <w:tblCaption w:val="Finaliser, vérifier, exporter et contrôler"/>
         <w:tblDescription w:val="Une ligne par point : identifiant et niveau, point à vérifier, cases de suivi et notes."/>
       </w:tblPr>
       <w:tblGrid>
-        <w:gridCol w:w="2880"/>
-        <w:gridCol w:w="2880"/>
-        <w:gridCol w:w="2880"/>
+        <w:gridCol w:w="1872"/>
+        <w:gridCol w:w="4608"/>
+        <w:gridCol w:w="2160"/>
       </w:tblGrid>
       <w:tr>
         <w:trPr>
@@ -1096,7 +1101,7 @@
         </w:trPr>
         <w:tc>
           <w:tcPr>
-            <w:tcW w:type="dxa" w:w="2880"/>
+            <w:tcW w:type="dxa" w:w="1872"/>
           </w:tcPr>
           <w:p>
             <w:r>
@@ -1109,7 +1114,7 @@
         </w:tc>
         <w:tc>
           <w:tcPr>
-            <w:tcW w:type="dxa" w:w="2880"/>
+            <w:tcW w:type="dxa" w:w="4608"/>
           </w:tcPr>
           <w:p>
             <w:r>
@@ -1122,7 +1127,7 @@
         </w:tc>
         <w:tc>
           <w:tcPr>
-            <w:tcW w:type="dxa" w:w="2880"/>
+            <w:tcW w:type="dxa" w:w="2160"/>
           </w:tcPr>
           <w:p>
             <w:r>
@@ -1140,7 +1145,7 @@
         </w:trPr>
         <w:tc>
           <w:tcPr>
-            <w:tcW w:type="dxa" w:w="2880"/>
+            <w:tcW w:type="dxa" w:w="1872"/>
           </w:tcPr>
           <w:p>
             <w:r>
@@ -1150,7 +1155,7 @@
         </w:tc>
         <w:tc>
           <w:tcPr>
-            <w:tcW w:type="dxa" w:w="2880"/>
+            <w:tcW w:type="dxa" w:w="4608"/>
           </w:tcPr>
           <w:p>
             <w:r>
@@ -1160,7 +1165,7 @@
         </w:tc>
         <w:tc>
           <w:tcPr>
-            <w:tcW w:type="dxa" w:w="2880"/>
+            <w:tcW w:type="dxa" w:w="2160"/>
           </w:tcPr>
           <w:p>
             <w:r>
@@ -1181,7 +1186,7 @@
         </w:trPr>
         <w:tc>
           <w:tcPr>
-            <w:tcW w:type="dxa" w:w="2880"/>
+            <w:tcW w:type="dxa" w:w="1872"/>
           </w:tcPr>
           <w:p>
             <w:r>
@@ -1191,7 +1196,7 @@
         </w:tc>
         <w:tc>
           <w:tcPr>
-            <w:tcW w:type="dxa" w:w="2880"/>
+            <w:tcW w:type="dxa" w:w="4608"/>
           </w:tcPr>
           <w:p>
             <w:r>
@@ -1201,7 +1206,7 @@
         </w:tc>
         <w:tc>
           <w:tcPr>
-            <w:tcW w:type="dxa" w:w="2880"/>
+            <w:tcW w:type="dxa" w:w="2160"/>
           </w:tcPr>
           <w:p>
             <w:r>
@@ -1222,7 +1227,7 @@
         </w:trPr>
         <w:tc>
           <w:tcPr>
-            <w:tcW w:type="dxa" w:w="2880"/>
+            <w:tcW w:type="dxa" w:w="1872"/>
           </w:tcPr>
           <w:p>
             <w:r>
@@ -1232,7 +1237,7 @@
         </w:tc>
         <w:tc>
           <w:tcPr>
-            <w:tcW w:type="dxa" w:w="2880"/>
+            <w:tcW w:type="dxa" w:w="4608"/>
           </w:tcPr>
           <w:p>
             <w:r>
@@ -1242,7 +1247,7 @@
         </w:tc>
         <w:tc>
           <w:tcPr>
-            <w:tcW w:type="dxa" w:w="2880"/>
+            <w:tcW w:type="dxa" w:w="2160"/>
           </w:tcPr>
           <w:p>
             <w:r>
@@ -1263,7 +1268,7 @@
         </w:trPr>
         <w:tc>
           <w:tcPr>
-            <w:tcW w:type="dxa" w:w="2880"/>
+            <w:tcW w:type="dxa" w:w="1872"/>
           </w:tcPr>
           <w:p>
             <w:r>
@@ -1273,7 +1278,7 @@
         </w:tc>
         <w:tc>
           <w:tcPr>
-            <w:tcW w:type="dxa" w:w="2880"/>
+            <w:tcW w:type="dxa" w:w="4608"/>
           </w:tcPr>
           <w:p>
             <w:r>
@@ -1283,7 +1288,7 @@
         </w:tc>
         <w:tc>
           <w:tcPr>
-            <w:tcW w:type="dxa" w:w="2880"/>
+            <w:tcW w:type="dxa" w:w="2160"/>
           </w:tcPr>
           <w:p>
             <w:r>
@@ -1317,14 +1322,15 @@
         <w:tblStyle w:val="TableGrid"/>
         <w:tblW w:type="auto" w:w="0"/>
         <w:jc w:val="center"/>
+        <w:tblLayout w:type="fixed"/>
         <w:tblLook w:firstColumn="1" w:firstRow="1" w:lastColumn="0" w:lastRow="0" w:noHBand="0" w:noVBand="1" w:val="04A0"/>
         <w:tblCaption w:val="Contrôles signalés"/>
         <w:tblDescription w:val="Une ligne par point : identifiant et niveau, point à vérifier, cases de suivi et notes."/>
       </w:tblPr>
       <w:tblGrid>
-        <w:gridCol w:w="2880"/>
-        <w:gridCol w:w="2880"/>
-        <w:gridCol w:w="2880"/>
+        <w:gridCol w:w="1872"/>
+        <w:gridCol w:w="4608"/>
+        <w:gridCol w:w="2160"/>
       </w:tblGrid>
       <w:tr>
         <w:trPr>
@@ -1333,7 +1339,7 @@
         </w:trPr>
         <w:tc>
           <w:tcPr>
-            <w:tcW w:type="dxa" w:w="2880"/>
+            <w:tcW w:type="dxa" w:w="1872"/>
           </w:tcPr>
           <w:p>
             <w:r>
@@ -1346,7 +1352,7 @@
         </w:tc>
         <w:tc>
           <w:tcPr>
-            <w:tcW w:type="dxa" w:w="2880"/>
+            <w:tcW w:type="dxa" w:w="4608"/>
           </w:tcPr>
           <w:p>
             <w:r>
@@ -1359,7 +1365,7 @@
         </w:tc>
         <w:tc>
           <w:tcPr>
-            <w:tcW w:type="dxa" w:w="2880"/>
+            <w:tcW w:type="dxa" w:w="2160"/>
           </w:tcPr>
           <w:p>
             <w:r>
@@ -1377,7 +1383,7 @@
         </w:trPr>
         <w:tc>
           <w:tcPr>
-            <w:tcW w:type="dxa" w:w="2880"/>
+            <w:tcW w:type="dxa" w:w="1872"/>
           </w:tcPr>
           <w:p>
             <w:r>
@@ -1387,7 +1393,7 @@
         </w:tc>
         <w:tc>
           <w:tcPr>
-            <w:tcW w:type="dxa" w:w="2880"/>
+            <w:tcW w:type="dxa" w:w="4608"/>
           </w:tcPr>
           <w:p>
             <w:r>
@@ -1397,7 +1403,7 @@
         </w:tc>
         <w:tc>
           <w:tcPr>
-            <w:tcW w:type="dxa" w:w="2880"/>
+            <w:tcW w:type="dxa" w:w="2160"/>
           </w:tcPr>
           <w:p>
             <w:r>
@@ -1418,7 +1424,7 @@
         </w:trPr>
         <w:tc>
           <w:tcPr>
-            <w:tcW w:type="dxa" w:w="2880"/>
+            <w:tcW w:type="dxa" w:w="1872"/>
           </w:tcPr>
           <w:p>
             <w:r>
@@ -1428,7 +1434,7 @@
         </w:tc>
         <w:tc>
           <w:tcPr>
-            <w:tcW w:type="dxa" w:w="2880"/>
+            <w:tcW w:type="dxa" w:w="4608"/>
           </w:tcPr>
           <w:p>
             <w:r>
@@ -1438,7 +1444,7 @@
         </w:tc>
         <w:tc>
           <w:tcPr>
-            <w:tcW w:type="dxa" w:w="2880"/>
+            <w:tcW w:type="dxa" w:w="2160"/>
           </w:tcPr>
           <w:p>
             <w:r>
@@ -1459,7 +1465,7 @@
         </w:trPr>
         <w:tc>
           <w:tcPr>
-            <w:tcW w:type="dxa" w:w="2880"/>
+            <w:tcW w:type="dxa" w:w="1872"/>
           </w:tcPr>
           <w:p>
             <w:r>
@@ -1469,7 +1475,7 @@
         </w:tc>
         <w:tc>
           <w:tcPr>
-            <w:tcW w:type="dxa" w:w="2880"/>
+            <w:tcW w:type="dxa" w:w="4608"/>
           </w:tcPr>
           <w:p>
             <w:r>
@@ -1479,7 +1485,7 @@
         </w:tc>
         <w:tc>
           <w:tcPr>
-            <w:tcW w:type="dxa" w:w="2880"/>
+            <w:tcW w:type="dxa" w:w="2160"/>
           </w:tcPr>
           <w:p>
             <w:r>
@@ -1500,7 +1506,7 @@
         </w:trPr>
         <w:tc>
           <w:tcPr>
-            <w:tcW w:type="dxa" w:w="2880"/>
+            <w:tcW w:type="dxa" w:w="1872"/>
           </w:tcPr>
           <w:p>
             <w:r>
@@ -1510,7 +1516,7 @@
         </w:tc>
         <w:tc>
           <w:tcPr>
-            <w:tcW w:type="dxa" w:w="2880"/>
+            <w:tcW w:type="dxa" w:w="4608"/>
           </w:tcPr>
           <w:p>
             <w:r>
@@ -1520,7 +1526,7 @@
         </w:tc>
         <w:tc>
           <w:tcPr>
-            <w:tcW w:type="dxa" w:w="2880"/>
+            <w:tcW w:type="dxa" w:w="2160"/>
           </w:tcPr>
           <w:p>
             <w:r>
@@ -1541,7 +1547,7 @@
         </w:trPr>
         <w:tc>
           <w:tcPr>
-            <w:tcW w:type="dxa" w:w="2880"/>
+            <w:tcW w:type="dxa" w:w="1872"/>
           </w:tcPr>
           <w:p>
             <w:r>
@@ -1551,7 +1557,7 @@
         </w:tc>
         <w:tc>
           <w:tcPr>
-            <w:tcW w:type="dxa" w:w="2880"/>
+            <w:tcW w:type="dxa" w:w="4608"/>
           </w:tcPr>
           <w:p>
             <w:r>
@@ -1561,7 +1567,7 @@
         </w:tc>
         <w:tc>
           <w:tcPr>
-            <w:tcW w:type="dxa" w:w="2880"/>
+            <w:tcW w:type="dxa" w:w="2160"/>
           </w:tcPr>
           <w:p>
             <w:r>
@@ -2127,7 +2133,7 @@
       <w:outlineLvl w:val="0"/>
     </w:pPr>
     <w:rPr>
-      <w:rFonts w:asciiTheme="majorHAnsi" w:eastAsiaTheme="majorEastAsia" w:hAnsiTheme="majorHAnsi" w:cstheme="majorBidi"/>
+      <w:rFonts w:ascii="Arial" w:hAnsi="Arial" w:eastAsia="Arial" w:cs="Arial"/>
       <w:b/>
       <w:bCs/>
       <w:color w:val="365F91" w:themeColor="accent1" w:themeShade="BF"/>
@@ -2420,7 +2426,7 @@
       <w:contextualSpacing/>
     </w:pPr>
     <w:rPr>
-      <w:rFonts w:asciiTheme="majorHAnsi" w:eastAsiaTheme="majorEastAsia" w:hAnsiTheme="majorHAnsi" w:cstheme="majorBidi"/>
+      <w:rFonts w:ascii="Arial" w:hAnsi="Arial" w:eastAsia="Arial" w:cs="Arial"/>
       <w:color w:val="17365D" w:themeColor="text2" w:themeShade="BF"/>
       <w:spacing w:val="5"/>
       <w:kern w:val="28"/>

</xml_diff>